<commit_message>
docs: add infra/MLOps/GitHub section to the mémoire report
New section 5 "Ingénierie logicielle et MLOps": Git/GitHub branching
workflow, automated test coverage, MLflow experiment tracking, and
the VPS deployment plan (path-based nginx routing, Docker isolation)
that was already reconnoitered but not yet described in the report.
Subsequent sections renumbered (6 Discussion, 7 Perspectives,
8 Conclusion); bibliography and conclusion updated accordingly.
</commit_message>
<xml_diff>
--- a/docs/rapport.docx
+++ b/docs/rapport.docx
@@ -1646,7 +1646,7 @@
         <w:pStyle w:val="Heading1"/>
       </w:pPr>
       <w:r>
-        <w:t>5. Discussion et limites</w:t>
+        <w:t>5. Ingénierie logicielle et MLOps</w:t>
       </w:r>
     </w:p>
     <w:p>
@@ -1654,7 +1654,233 @@
         <w:pStyle w:val="Heading2"/>
       </w:pPr>
       <w:r>
-        <w:t>5.1 Risque de circularité avec l'EPSS</w:t>
+        <w:t>5.1 Gestion de version et organisation du dépôt</w:t>
+      </w:r>
+    </w:p>
+    <w:p>
+      <w:r>
+        <w:t>L'ensemble du code est versionné sur GitHub (dépôt git-saidmansour/Projet-de-fin-d-eutde-DU-Data-Analytics). Le développement suit une stratégie de branches fonctionnelles : chaque étape du pipeline (collecte, feature engineering, modélisation, interprétabilité, dashboard/API) a été développée sur sa propre branche (feature/collect-nvd, feature/modeling, feature/dashboard-api...), testée, puis fusionnée dans main en fast-forward une fois validée. Les commits sont progressifs et atomiques — un commit correspond à un changement logique unique et testé, plutôt qu'à un dépôt monolithique de code en fin de projet — afin de conserver un historique lisible et auditable de la construction du pipeline.</w:t>
+      </w:r>
+    </w:p>
+    <w:p>
+      <w:pPr>
+        <w:pStyle w:val="Heading2"/>
+      </w:pPr>
+      <w:r>
+        <w:t>5.2 Qualité et tests automatisés</w:t>
+      </w:r>
+    </w:p>
+    <w:p>
+      <w:r>
+        <w:t>Le projet compte 40 tests unitaires (pytest), exécutés à chaque étape avant intégration : parsing des réponses API (NVD, EPSS, KEV), couche de stockage SQLite (insertion/mise à jour), feature engineering (encodages CVSS, catégorisation CWE, mots-clés), split temporel, pipeline d'entraînement (smoke test sur données synthétiques), interprétabilité SHAP, et endpoints de l'API FastAPI (via TestClient). Chaque module est en outre validé une seconde fois par exécution réelle sur les données collectées avant d'être intégré, afin de détecter les écarts entre comportement synthétique et comportement réel (c'est ainsi qu'a été détecté l'incident LightGBM décrit en 4.2).</w:t>
+      </w:r>
+    </w:p>
+    <w:p>
+      <w:pPr>
+        <w:pStyle w:val="Heading2"/>
+      </w:pPr>
+      <w:r>
+        <w:t>5.3 Suivi des expériences (MLOps) — MLflow</w:t>
+      </w:r>
+    </w:p>
+    <w:p>
+      <w:r>
+        <w:t>L'entraînement des modèles est instrumenté avec MLflow. Chaque exécution (un run par modèle, plus un run pour la baseline EPSS) enregistre automatiquement ses hyperparamètres, ses métriques (ROC-AUC, PR-AUC, précision, rappel, F1, indicateur de dépassement de la baseline EPSS) et le pipeline scikit-learn entraîné comme artefact versionné. Le stockage repose sur une base SQLite locale (mlruns/mlflow.db), consultable via l'interface web `mlflow ui`, sans dépendance à un serveur de tracking distant. Cette traçabilité permet de comparer objectivement les runs successifs (par exemple avant/après la correction du paramétrage de LightGBM) et de retrouver l'artefact exact associé à chaque résultat rapporté dans ce document.</w:t>
+      </w:r>
+    </w:p>
+    <w:p>
+      <w:pPr>
+        <w:pStyle w:val="Heading2"/>
+      </w:pPr>
+      <w:r>
+        <w:t>5.4 Infrastructure de déploiement</w:t>
+      </w:r>
+    </w:p>
+    <w:p>
+      <w:r>
+        <w:t>Le déploiement cible un VPS personnel (OVH) hébergeant déjà un portfolio en production, avec un nom de domaine unique (matane-mansour.com), un reverse proxy nginx et un certificat HTTPS Let's Encrypt géré par Certbot. L'infrastructure existante a été inspectée (accès SSH, inventaire des conteneurs Docker actifs et de la configuration nginx) afin de préparer un déploiement sans interférence avec le portfolio déjà en ligne.</w:t>
+      </w:r>
+    </w:p>
+    <w:p>
+      <w:r>
+        <w:t>L'absence de sous-domaine disponible chez l'hébergeur exclut une architecture par sous-domaine dédié (par exemple cve.matane-mansour.com). La stratégie retenue est un routage par chemin (path-based routing) : l'API et le dashboard seront packagés en conteneurs Docker distincts, exposés uniquement en local (127.0.0.1, comme le conteneur du portfolio existant), et routés depuis le même certificat et le même bloc serveur nginx via des préfixes d'URL dédiés (/cve-predictor/ pour le dashboard, /cve-predictor/api/ pour l'API) — sans nouvelle entrée DNS ni nouveau certificat, et sans modifier la configuration servant le portfolio existant.</w:t>
+      </w:r>
+    </w:p>
+    <w:tbl>
+      <w:tblPr>
+        <w:tblStyle w:val="LightGrid-Accent1"/>
+        <w:tblW w:type="auto" w:w="0"/>
+        <w:jc w:val="center"/>
+        <w:tblLook w:firstColumn="1" w:firstRow="1" w:lastColumn="0" w:lastRow="0" w:noHBand="0" w:noVBand="1" w:val="04A0"/>
+      </w:tblPr>
+      <w:tblGrid>
+        <w:gridCol w:w="4320"/>
+        <w:gridCol w:w="4320"/>
+      </w:tblGrid>
+      <w:tr>
+        <w:tc>
+          <w:tcPr>
+            <w:tcW w:type="dxa" w:w="4320"/>
+          </w:tcPr>
+          <w:p>
+            <w:r>
+              <w:rPr>
+                <w:b/>
+              </w:rPr>
+              <w:t>Composant</w:t>
+            </w:r>
+          </w:p>
+        </w:tc>
+        <w:tc>
+          <w:tcPr>
+            <w:tcW w:type="dxa" w:w="4320"/>
+          </w:tcPr>
+          <w:p>
+            <w:r>
+              <w:rPr>
+                <w:b/>
+              </w:rPr>
+              <w:t>Choix technique</w:t>
+            </w:r>
+          </w:p>
+        </w:tc>
+      </w:tr>
+      <w:tr>
+        <w:tc>
+          <w:tcPr>
+            <w:tcW w:type="dxa" w:w="4320"/>
+          </w:tcPr>
+          <w:p>
+            <w:r>
+              <w:t>Hébergement</w:t>
+            </w:r>
+          </w:p>
+        </w:tc>
+        <w:tc>
+          <w:tcPr>
+            <w:tcW w:type="dxa" w:w="4320"/>
+          </w:tcPr>
+          <w:p>
+            <w:r>
+              <w:t>VPS OVH existant (Ubuntu, Docker déjà en place)</w:t>
+            </w:r>
+          </w:p>
+        </w:tc>
+      </w:tr>
+      <w:tr>
+        <w:tc>
+          <w:tcPr>
+            <w:tcW w:type="dxa" w:w="4320"/>
+          </w:tcPr>
+          <w:p>
+            <w:r>
+              <w:t>Nom de domaine</w:t>
+            </w:r>
+          </w:p>
+        </w:tc>
+        <w:tc>
+          <w:tcPr>
+            <w:tcW w:type="dxa" w:w="4320"/>
+          </w:tcPr>
+          <w:p>
+            <w:r>
+              <w:t>matane-mansour.com (partagé avec le portfolio, pas de sous-domaine)</w:t>
+            </w:r>
+          </w:p>
+        </w:tc>
+      </w:tr>
+      <w:tr>
+        <w:tc>
+          <w:tcPr>
+            <w:tcW w:type="dxa" w:w="4320"/>
+          </w:tcPr>
+          <w:p>
+            <w:r>
+              <w:t>Routage</w:t>
+            </w:r>
+          </w:p>
+        </w:tc>
+        <w:tc>
+          <w:tcPr>
+            <w:tcW w:type="dxa" w:w="4320"/>
+          </w:tcPr>
+          <w:p>
+            <w:r>
+              <w:t>nginx — path-based routing (/cve-predictor/, /cve-predictor/api/)</w:t>
+            </w:r>
+          </w:p>
+        </w:tc>
+      </w:tr>
+      <w:tr>
+        <w:tc>
+          <w:tcPr>
+            <w:tcW w:type="dxa" w:w="4320"/>
+          </w:tcPr>
+          <w:p>
+            <w:r>
+              <w:t>TLS</w:t>
+            </w:r>
+          </w:p>
+        </w:tc>
+        <w:tc>
+          <w:tcPr>
+            <w:tcW w:type="dxa" w:w="4320"/>
+          </w:tcPr>
+          <w:p>
+            <w:r>
+              <w:t>Certificat Let's Encrypt existant, réutilisé (aucun nouveau certificat)</w:t>
+            </w:r>
+          </w:p>
+        </w:tc>
+      </w:tr>
+      <w:tr>
+        <w:tc>
+          <w:tcPr>
+            <w:tcW w:type="dxa" w:w="4320"/>
+          </w:tcPr>
+          <w:p>
+            <w:r>
+              <w:t>Isolation</w:t>
+            </w:r>
+          </w:p>
+        </w:tc>
+        <w:tc>
+          <w:tcPr>
+            <w:tcW w:type="dxa" w:w="4320"/>
+          </w:tcPr>
+          <w:p>
+            <w:r>
+              <w:t>Conteneurs Docker séparés, exposition strictement locale (127.0.0.1)</w:t>
+            </w:r>
+          </w:p>
+        </w:tc>
+      </w:tr>
+    </w:tbl>
+    <w:p/>
+    <w:p>
+      <w:r>
+        <w:t>Au moment de la rédaction de ce document, la reconnaissance de l'environnement est achevée et le plan de déploiement validé ; la mise en production effective (conteneurisation de l'API et du dashboard, écriture du bloc nginx, démarrage des services) reste à finaliser (cf. Perspectives).</w:t>
+      </w:r>
+    </w:p>
+    <w:p>
+      <w:r>
+        <w:br w:type="page"/>
+      </w:r>
+    </w:p>
+    <w:p>
+      <w:pPr>
+        <w:pStyle w:val="Heading1"/>
+      </w:pPr>
+      <w:r>
+        <w:t>6. Discussion et limites</w:t>
+      </w:r>
+    </w:p>
+    <w:p>
+      <w:pPr>
+        <w:pStyle w:val="Heading2"/>
+      </w:pPr>
+      <w:r>
+        <w:t>6.1 Risque de circularité avec l'EPSS</w:t>
       </w:r>
     </w:p>
     <w:p>
@@ -1667,7 +1893,7 @@
         <w:pStyle w:val="Heading2"/>
       </w:pPr>
       <w:r>
-        <w:t>5.2 Limites du label CISA KEV</w:t>
+        <w:t>6.2 Limites du label CISA KEV</w:t>
       </w:r>
     </w:p>
     <w:p>
@@ -1680,7 +1906,7 @@
         <w:pStyle w:val="Heading2"/>
       </w:pPr>
       <w:r>
-        <w:t>5.3 Validation temporelle unique</w:t>
+        <w:t>6.3 Validation temporelle unique</w:t>
       </w:r>
     </w:p>
     <w:p>
@@ -1693,7 +1919,7 @@
         <w:pStyle w:val="Heading2"/>
       </w:pPr>
       <w:r>
-        <w:t>5.4 Déséquilibre extrême de la cible</w:t>
+        <w:t>6.4 Déséquilibre extrême de la cible</w:t>
       </w:r>
     </w:p>
     <w:p>
@@ -1706,7 +1932,7 @@
         <w:pStyle w:val="Heading2"/>
       </w:pPr>
       <w:r>
-        <w:t>5.5 Fraîcheur des données</w:t>
+        <w:t>6.5 Fraîcheur des données</w:t>
       </w:r>
     </w:p>
     <w:p>
@@ -1724,7 +1950,7 @@
         <w:pStyle w:val="Heading1"/>
       </w:pPr>
       <w:r>
-        <w:t>6. Perspectives</w:t>
+        <w:t>7. Perspectives</w:t>
       </w:r>
     </w:p>
     <w:p>
@@ -1732,7 +1958,7 @@
         <w:pStyle w:val="ListBullet"/>
       </w:pPr>
       <w:r>
-        <w:t>Déploiement en production sur un VPS existant, via routage par chemin nginx (sans sous-domaine dédié), conteneurisation Docker de l'API et du dashboard aux côtés de l'infrastructure déjà en place.</w:t>
+        <w:t>Finaliser le déploiement en production sur le VPS (cf. 5.4) : conteneurisation Docker de l'API et du dashboard, écriture du bloc de routage nginx, démarrage et supervision des services.</w:t>
       </w:r>
     </w:p>
     <w:p>
@@ -1793,12 +2019,12 @@
         <w:pStyle w:val="Heading1"/>
       </w:pPr>
       <w:r>
-        <w:t>7. Conclusion</w:t>
+        <w:t>8. Conclusion</w:t>
       </w:r>
     </w:p>
     <w:p>
       <w:r>
-        <w:t>Ce projet démontre la faisabilité d'un pipeline complet — de la collecte de données publiques à un dashboard interactif — pour prédire l'exploitabilité réelle d'une vulnérabilité CVE, avec des performances qui dépassent la référence du domaine (EPSS) sur le jeu de données constitué. Au-delà des résultats numériques, la démarche a mis en évidence l'importance d'une validation empirique rigoureuse à chaque étape (le cas LightGBM), d'une méthodologie d'évaluation adaptée au déséquilibre extrême des classes, et d'une interprétabilité concrète (SHAP) permettant de justifier chaque prédiction — condition nécessaire à l'adoption d'un tel outil par des équipes de sécurité opérationnelles.</w:t>
+        <w:t>Ce projet démontre la faisabilité d'un pipeline complet — de la collecte de données publiques à un dashboard interactif — pour prédire l'exploitabilité réelle d'une vulnérabilité CVE, avec des performances qui dépassent la référence du domaine (EPSS) sur le jeu de données constitué. Au-delà des résultats numériques, la démarche a mis en évidence l'importance d'une validation empirique rigoureuse à chaque étape (le cas LightGBM), d'une méthodologie d'évaluation adaptée au déséquilibre extrême des classes, et d'une interprétabilité concrète (SHAP) permettant de justifier chaque prédiction — condition nécessaire à l'adoption d'un tel outil par des équipes de sécurité opérationnelles. Sur le plan ingénierie, le projet a également été l'occasion de mettre en pratique des standards d'outillage professionnels — gestion de version structurée, tests automatisés, suivi d'expériences MLOps (MLflow) et exposition via une API — qui dépassent le seul exercice de modélisation et rapprochent ce travail d'un produit de données déployable.</w:t>
       </w:r>
     </w:p>
     <w:p>
@@ -1884,6 +2110,38 @@
       </w:pPr>
       <w:r>
         <w:t>Documentation scikit-learn. https://scikit-learn.org/</w:t>
+      </w:r>
+    </w:p>
+    <w:p>
+      <w:pPr>
+        <w:pStyle w:val="ListBullet"/>
+      </w:pPr>
+      <w:r>
+        <w:t>Documentation MLflow — Tracking. https://mlflow.org/docs/latest/tracking.html</w:t>
+      </w:r>
+    </w:p>
+    <w:p>
+      <w:pPr>
+        <w:pStyle w:val="ListBullet"/>
+      </w:pPr>
+      <w:r>
+        <w:t>Documentation FastAPI. https://fastapi.tiangolo.com/</w:t>
+      </w:r>
+    </w:p>
+    <w:p>
+      <w:pPr>
+        <w:pStyle w:val="ListBullet"/>
+      </w:pPr>
+      <w:r>
+        <w:t>Documentation Streamlit. https://docs.streamlit.io/</w:t>
+      </w:r>
+    </w:p>
+    <w:p>
+      <w:pPr>
+        <w:pStyle w:val="ListBullet"/>
+      </w:pPr>
+      <w:r>
+        <w:t>Dépôt du projet — GitHub. https://github.com/git-saidmansour/Projet-de-fin-d-eutde-DU-Data-Analytics</w:t>
       </w:r>
     </w:p>
     <w:p>

</xml_diff>

<commit_message>
docs: update report with final production deployment status
Section 5.4 rewritten from "plan validé, reste à finaliser" to
past-tense description of the actual deployment (image build, backup
+ validation of nginx config before reload, end-to-end HTTPS
verification). Adds the live URLs to the résumé, the 5.4 table, and
removes the now-stale "finalize deployment" perspective item.
</commit_message>
<xml_diff>
--- a/docs/rapport.docx
+++ b/docs/rapport.docx
@@ -115,7 +115,7 @@
     </w:p>
     <w:p>
       <w:r>
-        <w:t>378 393 CVE ont été collectées depuis l'API NVD, enrichies de 360 399 scores EPSS et croisées avec le catalogue CISA KEV (1 665 vulnérabilités confirmées exploitées). Quatre modèles de classification (XGBoost, LightGBM, Random Forest, régression logistique) ont été entraînés sur un split temporel et comparés à la baseline EPSS. Le modèle XGBoost final atteint un AUC-ROC de 0,992 sur le jeu de test et dépasse la baseline EPSS sur l'ensemble des métriques (PR-AUC, précision, rappel, F1). L'interprétabilité du modèle est assurée par SHAP, et les résultats sont exposés via une API FastAPI et un dashboard Streamlit permettant l'exploration interactive des prédictions.</w:t>
+        <w:t>378 393 CVE ont été collectées depuis l'API NVD, enrichies de 360 399 scores EPSS et croisées avec le catalogue CISA KEV (1 665 vulnérabilités confirmées exploitées). Quatre modèles de classification (XGBoost, LightGBM, Random Forest, régression logistique) ont été entraînés sur un split temporel et comparés à la baseline EPSS. Le modèle XGBoost final atteint un AUC-ROC de 0,992 sur le jeu de test et dépasse la baseline EPSS sur l'ensemble des métriques (PR-AUC, précision, rappel, F1). L'interprétabilité du modèle est assurée par SHAP, et les résultats sont exposés via une API FastAPI et un dashboard Streamlit permettant l'exploration interactive des prédictions. L'ensemble est déployé en production (https://matane-mansour.com/cve-predictor/).</w:t>
       </w:r>
     </w:p>
     <w:p>
@@ -1698,12 +1698,17 @@
     </w:p>
     <w:p>
       <w:r>
-        <w:t>Le déploiement cible un VPS personnel (OVH) hébergeant déjà un portfolio en production, avec un nom de domaine unique (matane-mansour.com), un reverse proxy nginx et un certificat HTTPS Let's Encrypt géré par Certbot. L'infrastructure existante a été inspectée (accès SSH, inventaire des conteneurs Docker actifs et de la configuration nginx) afin de préparer un déploiement sans interférence avec le portfolio déjà en ligne.</w:t>
+        <w:t>Le projet est déployé en production sur un VPS personnel (OVH) hébergeant déjà un portfolio, avec un nom de domaine unique (matane-mansour.com), un reverse proxy nginx et un certificat HTTPS Let's Encrypt géré par Certbot. L'infrastructure existante a d'abord été inspectée (accès SSH, inventaire des conteneurs Docker actifs et de la configuration nginx) afin de déployer sans interférence avec le portfolio déjà en ligne.</w:t>
       </w:r>
     </w:p>
     <w:p>
       <w:r>
-        <w:t>L'absence de sous-domaine disponible chez l'hébergeur exclut une architecture par sous-domaine dédié (par exemple cve.matane-mansour.com). La stratégie retenue est un routage par chemin (path-based routing) : l'API et le dashboard seront packagés en conteneurs Docker distincts, exposés uniquement en local (127.0.0.1, comme le conteneur du portfolio existant), et routés depuis le même certificat et le même bloc serveur nginx via des préfixes d'URL dédiés (/cve-predictor/ pour le dashboard, /cve-predictor/api/ pour l'API) — sans nouvelle entrée DNS ni nouveau certificat, et sans modifier la configuration servant le portfolio existant.</w:t>
+        <w:t>L'absence de sous-domaine disponible chez l'hébergeur excluait une architecture par sous-domaine dédié (par exemple cve.matane-mansour.com). La stratégie retenue est un routage par chemin (path-based routing) : l'API et le dashboard sont packagés en deux conteneurs Docker distincts (docker-compose.yml), exposés uniquement en local (127.0.0.1, comme le conteneur du portfolio), et routés depuis le même certificat et le même bloc serveur nginx via des préfixes d'URL dédiés — sans nouvelle entrée DNS, sans nouveau certificat, et sans modifier la configuration servant le portfolio existant, dont la disponibilité a été vérifiée après coup.</w:t>
+      </w:r>
+    </w:p>
+    <w:p>
+      <w:r>
+        <w:t>Les images Docker sont volontairement légères (dépendances de service uniquement — sans MLflow, Jupyter ni LightGBM, inutiles à l'inférence) et le répertoire de données est monté en volume plutôt que copié dans l'image, pour permettre un réentraînement sans reconstruction d'image. Seuls les deux artefacts nécessaires à l'inférence — la table de features (features.csv, 173 Mo) et le pipeline XGBoost entraîné (xgboost.joblib, 1 Mo) — ont été transférés vers le serveur, plutôt que la base SQLite complète (2,4 Go, incluant le JSON brut de chaque CVE, dont l'API n'a pas besoin).</w:t>
       </w:r>
     </w:p>
     <w:tbl>
@@ -1855,11 +1860,55 @@
           </w:p>
         </w:tc>
       </w:tr>
+      <w:tr>
+        <w:tc>
+          <w:tcPr>
+            <w:tcW w:type="dxa" w:w="4320"/>
+          </w:tcPr>
+          <w:p>
+            <w:r>
+              <w:t>Dashboard (production)</w:t>
+            </w:r>
+          </w:p>
+        </w:tc>
+        <w:tc>
+          <w:tcPr>
+            <w:tcW w:type="dxa" w:w="4320"/>
+          </w:tcPr>
+          <w:p>
+            <w:r>
+              <w:t>https://matane-mansour.com/cve-predictor/</w:t>
+            </w:r>
+          </w:p>
+        </w:tc>
+      </w:tr>
+      <w:tr>
+        <w:tc>
+          <w:tcPr>
+            <w:tcW w:type="dxa" w:w="4320"/>
+          </w:tcPr>
+          <w:p>
+            <w:r>
+              <w:t>API (production)</w:t>
+            </w:r>
+          </w:p>
+        </w:tc>
+        <w:tc>
+          <w:tcPr>
+            <w:tcW w:type="dxa" w:w="4320"/>
+          </w:tcPr>
+          <w:p>
+            <w:r>
+              <w:t>https://matane-mansour.com/cve-predictor/api/ (ex. /health, /cves, /cves/{cve_id})</w:t>
+            </w:r>
+          </w:p>
+        </w:tc>
+      </w:tr>
     </w:tbl>
     <w:p/>
     <w:p>
       <w:r>
-        <w:t>Au moment de la rédaction de ce document, la reconnaissance de l'environnement est achevée et le plan de déploiement validé ; la mise en production effective (conteneurisation de l'API et du dashboard, écriture du bloc nginx, démarrage des services) reste à finaliser (cf. Perspectives).</w:t>
+        <w:t>Le déploiement a été validé de bout en bout : construction des images sur le serveur, démarrage des conteneurs, sauvegarde de la configuration nginx avant modification, validation syntaxique (nginx -t) avant rechargement, puis vérification en HTTPS public que le portfolio, le dashboard et l'API répondent tous correctement (y compris les assets statiques Streamlit et une requête de prédiction complète sur une CVE réelle).</w:t>
       </w:r>
     </w:p>
     <w:p>
@@ -1958,7 +2007,7 @@
         <w:pStyle w:val="ListBullet"/>
       </w:pPr>
       <w:r>
-        <w:t>Finaliser le déploiement en production sur le VPS (cf. 5.4) : conteneurisation Docker de l'API et du dashboard, écriture du bloc de routage nginx, démarrage et supervision des services.</w:t>
+        <w:t>Automatisation de la collecte incrémentale (tâche planifiée quotidienne) et réentraînement périodique du modèle en production, avec redéploiement du volume de données sans reconstruction d'image.</w:t>
       </w:r>
     </w:p>
     <w:p>
@@ -1966,7 +2015,7 @@
         <w:pStyle w:val="ListBullet"/>
       </w:pPr>
       <w:r>
-        <w:t>Automatisation de la collecte incrémentale (tâche planifiée quotidienne) et réentraînement périodique du modèle.</w:t>
+        <w:t>Supervision du service déployé (journalisation, alerte en cas d'indisponibilité des conteneurs, suivi de la fraîcheur des données servies par le dashboard).</w:t>
       </w:r>
     </w:p>
     <w:p>
@@ -2006,7 +2055,7 @@
         <w:pStyle w:val="ListBullet"/>
       </w:pPr>
       <w:r>
-        <w:t>Ajout d'une authentification et d'une limite de débit sur l'API avant toute exposition publique.</w:t>
+        <w:t>Ajout d'une authentification et d'une limite de débit sur l'API avant toute exposition élargie.</w:t>
       </w:r>
     </w:p>
     <w:p>

</xml_diff>